<commit_message>
Round 3 sheet: consumer-track cards for return files (12/14) and the free-phone bill (11/14); scan pitches re-graded on both tracks
Co-Authored-By: Claude Opus 5.5 <noreply@anthropic.com>
Claude-Session: https://claude.ai/code/session_01JtBQ6dD3dNhmh23YuYWDfa
</commit_message>
<xml_diff>
--- a/runs/W_11042026/Pre_Bible_Round3_10_28.docx
+++ b/runs/W_11042026/Pre_Bible_Round3_10_28.docx
@@ -15,7 +15,7 @@
     </w:p>
     <w:p>
       <w:r>
-        <w:t>Prepared Oct 28 · F1 Oct 30, F2 Nov 4 · 13 pass the gate · Replaces the Oct 26 and 28 sheets.</w:t>
+        <w:t>Prepared Oct 28 · F1 Oct 30, F2 Nov 4 · 15 pass (13 scam, 2 consumer) · Replaces the Oct 26 and 28 sheets.</w:t>
       </w:r>
     </w:p>
     <w:p>
@@ -1013,7 +1013,7 @@
               <w:rPr>
                 <w:sz w:val="19"/>
               </w:rPr>
-              <w:t xml:space="preserve"> · 10/14 · B/C</w:t>
+              <w:t xml:space="preserve"> · 9/14 consumer · B/C</w:t>
             </w:r>
           </w:p>
         </w:tc>
@@ -1050,6 +1050,152 @@
           </w:p>
         </w:tc>
       </w:tr>
+      <w:tr>
+        <w:tc>
+          <w:tcPr>
+            <w:tcW w:type="dxa" w:w="432"/>
+          </w:tcPr>
+          <w:p>
+            <w:pPr>
+              <w:spacing w:after="40"/>
+            </w:pPr>
+            <w:r>
+              <w:rPr>
+                <w:sz w:val="19"/>
+              </w:rPr>
+              <w:t>14</w:t>
+            </w:r>
+          </w:p>
+        </w:tc>
+        <w:tc>
+          <w:tcPr>
+            <w:tcW w:type="dxa" w:w="2736"/>
+          </w:tcPr>
+          <w:p>
+            <w:pPr>
+              <w:spacing w:after="40"/>
+            </w:pPr>
+            <w:r>
+              <w:rPr>
+                <w:b/>
+                <w:sz w:val="19"/>
+              </w:rPr>
+              <w:t>STORES ARE KEEPING A FILE ON YOUR RETURNS</w:t>
+            </w:r>
+            <w:r>
+              <w:rPr>
+                <w:sz w:val="19"/>
+              </w:rPr>
+              <w:t xml:space="preserve"> · 12/14 consumer</w:t>
+            </w:r>
+          </w:p>
+        </w:tc>
+        <w:tc>
+          <w:tcPr>
+            <w:tcW w:type="dxa" w:w="3312"/>
+          </w:tcPr>
+          <w:p>
+            <w:pPr>
+              <w:spacing w:after="40"/>
+            </w:pPr>
+            <w:r>
+              <w:rPr>
+                <w:sz w:val="19"/>
+              </w:rPr>
+              <w:t>Stores Are BANNING You For THIS — Check Your Return File</w:t>
+            </w:r>
+          </w:p>
+        </w:tc>
+        <w:tc>
+          <w:tcPr>
+            <w:tcW w:type="dxa" w:w="3456"/>
+          </w:tcPr>
+          <w:p>
+            <w:pPr>
+              <w:spacing w:after="40"/>
+            </w:pPr>
+            <w:r>
+              <w:rPr>
+                <w:sz w:val="19"/>
+              </w:rPr>
+              <w:t>2.3M, https://youtu.be/XZemo1KVQMA</w:t>
+            </w:r>
+          </w:p>
+        </w:tc>
+      </w:tr>
+      <w:tr>
+        <w:tc>
+          <w:tcPr>
+            <w:tcW w:type="dxa" w:w="432"/>
+          </w:tcPr>
+          <w:p>
+            <w:pPr>
+              <w:spacing w:after="40"/>
+            </w:pPr>
+            <w:r>
+              <w:rPr>
+                <w:sz w:val="19"/>
+              </w:rPr>
+              <w:t>15</w:t>
+            </w:r>
+          </w:p>
+        </w:tc>
+        <w:tc>
+          <w:tcPr>
+            <w:tcW w:type="dxa" w:w="2736"/>
+          </w:tcPr>
+          <w:p>
+            <w:pPr>
+              <w:spacing w:after="40"/>
+            </w:pPr>
+            <w:r>
+              <w:rPr>
+                <w:b/>
+                <w:sz w:val="19"/>
+              </w:rPr>
+              <w:t>THE "FREE" PHONE THAT COST $1,200</w:t>
+            </w:r>
+            <w:r>
+              <w:rPr>
+                <w:sz w:val="19"/>
+              </w:rPr>
+              <w:t xml:space="preserve"> · 11/14 consumer</w:t>
+            </w:r>
+          </w:p>
+        </w:tc>
+        <w:tc>
+          <w:tcPr>
+            <w:tcW w:type="dxa" w:w="3312"/>
+          </w:tcPr>
+          <w:p>
+            <w:pPr>
+              <w:spacing w:after="40"/>
+            </w:pPr>
+            <w:r>
+              <w:rPr>
+                <w:sz w:val="19"/>
+              </w:rPr>
+              <w:t>The FREE Phone Deal — THEN Came a $1,200 Bill</w:t>
+            </w:r>
+          </w:p>
+        </w:tc>
+        <w:tc>
+          <w:tcPr>
+            <w:tcW w:type="dxa" w:w="3456"/>
+          </w:tcPr>
+          <w:p>
+            <w:pPr>
+              <w:spacing w:after="40"/>
+            </w:pPr>
+            <w:r>
+              <w:rPr>
+                <w:sz w:val="19"/>
+              </w:rPr>
+              <w:t>47K, https://youtu.be/PeUvfRhTVCw</w:t>
+            </w:r>
+          </w:p>
+        </w:tc>
+      </w:tr>
     </w:tbl>
     <w:p/>
     <w:p>
@@ -1071,7 +1217,7 @@
         <w:t>SLATE FIT:</w:t>
       </w:r>
       <w:r>
-        <w:t xml:space="preserve"> </w:t>
+        <w:t xml:space="preserve"> Consumer options: #14 and #15 are A-caliber on the consumer track (JEFF'S CALL: not a scam). </w:t>
       </w:r>
       <w:r>
         <w:rPr>
@@ -1118,6 +1264,15 @@
       </w:r>
       <w:r>
         <w:t xml:space="preserve"> READY · </w:t>
+      </w:r>
+      <w:r>
+        <w:rPr>
+          <w:b/>
+        </w:rPr>
+        <w:t>Track:</w:t>
+      </w:r>
+      <w:r>
+        <w:t xml:space="preserve"> SCAM · </w:t>
       </w:r>
       <w:r>
         <w:rPr>
@@ -1469,6 +1624,15 @@
         <w:rPr>
           <w:b/>
         </w:rPr>
+        <w:t>Track:</w:t>
+      </w:r>
+      <w:r>
+        <w:t xml:space="preserve"> SCAM · </w:t>
+      </w:r>
+      <w:r>
+        <w:rPr>
+          <w:b/>
+        </w:rPr>
         <w:t>Score:</w:t>
       </w:r>
       <w:r>
@@ -1818,6 +1982,15 @@
         <w:rPr>
           <w:b/>
         </w:rPr>
+        <w:t>Track:</w:t>
+      </w:r>
+      <w:r>
+        <w:t xml:space="preserve"> SCAM · </w:t>
+      </w:r>
+      <w:r>
+        <w:rPr>
+          <w:b/>
+        </w:rPr>
         <w:t>Score:</w:t>
       </w:r>
       <w:r>
@@ -2161,6 +2334,15 @@
         <w:rPr>
           <w:b/>
         </w:rPr>
+        <w:t>Track:</w:t>
+      </w:r>
+      <w:r>
+        <w:t xml:space="preserve"> SCAM · </w:t>
+      </w:r>
+      <w:r>
+        <w:rPr>
+          <w:b/>
+        </w:rPr>
         <w:t>Score:</w:t>
       </w:r>
       <w:r>
@@ -2507,6 +2689,15 @@
         <w:rPr>
           <w:b/>
         </w:rPr>
+        <w:t>Track:</w:t>
+      </w:r>
+      <w:r>
+        <w:t xml:space="preserve"> SCAM · </w:t>
+      </w:r>
+      <w:r>
+        <w:rPr>
+          <w:b/>
+        </w:rPr>
         <w:t>Score:</w:t>
       </w:r>
       <w:r>
@@ -2844,6 +3035,15 @@
         <w:rPr>
           <w:b/>
         </w:rPr>
+        <w:t>Track:</w:t>
+      </w:r>
+      <w:r>
+        <w:t xml:space="preserve"> SCAM · </w:t>
+      </w:r>
+      <w:r>
+        <w:rPr>
+          <w:b/>
+        </w:rPr>
         <w:t>Score:</w:t>
       </w:r>
       <w:r>
@@ -3172,6 +3372,15 @@
         <w:rPr>
           <w:b/>
         </w:rPr>
+        <w:t>Track:</w:t>
+      </w:r>
+      <w:r>
+        <w:t xml:space="preserve"> SCAM · </w:t>
+      </w:r>
+      <w:r>
+        <w:rPr>
+          <w:b/>
+        </w:rPr>
         <w:t>Score:</w:t>
       </w:r>
       <w:r>
@@ -3485,6 +3694,15 @@
         <w:rPr>
           <w:b/>
         </w:rPr>
+        <w:t>Track:</w:t>
+      </w:r>
+      <w:r>
+        <w:t xml:space="preserve"> SCAM · </w:t>
+      </w:r>
+      <w:r>
+        <w:rPr>
+          <w:b/>
+        </w:rPr>
         <w:t>Score:</w:t>
       </w:r>
       <w:r>
@@ -3840,6 +4058,15 @@
         <w:rPr>
           <w:b/>
         </w:rPr>
+        <w:t>Track:</w:t>
+      </w:r>
+      <w:r>
+        <w:t xml:space="preserve"> SCAM · </w:t>
+      </w:r>
+      <w:r>
+        <w:rPr>
+          <w:b/>
+        </w:rPr>
         <w:t>Score:</w:t>
       </w:r>
       <w:r>
@@ -4177,6 +4404,15 @@
         <w:rPr>
           <w:b/>
         </w:rPr>
+        <w:t>Track:</w:t>
+      </w:r>
+      <w:r>
+        <w:t xml:space="preserve"> SCAM · </w:t>
+      </w:r>
+      <w:r>
+        <w:rPr>
+          <w:b/>
+        </w:rPr>
         <w:t>Score:</w:t>
       </w:r>
       <w:r>
@@ -4508,6 +4744,15 @@
         <w:rPr>
           <w:b/>
         </w:rPr>
+        <w:t>Track:</w:t>
+      </w:r>
+      <w:r>
+        <w:t xml:space="preserve"> SCAM · </w:t>
+      </w:r>
+      <w:r>
+        <w:rPr>
+          <w:b/>
+        </w:rPr>
         <w:t>Score:</w:t>
       </w:r>
       <w:r>
@@ -4809,6 +5054,15 @@
         <w:rPr>
           <w:b/>
         </w:rPr>
+        <w:t>Track:</w:t>
+      </w:r>
+      <w:r>
+        <w:t xml:space="preserve"> SCAM · </w:t>
+      </w:r>
+      <w:r>
+        <w:rPr>
+          <w:b/>
+        </w:rPr>
         <w:t>Score:</w:t>
       </w:r>
       <w:r>
@@ -5122,10 +5376,19 @@
         <w:rPr>
           <w:b/>
         </w:rPr>
+        <w:t>Track:</w:t>
+      </w:r>
+      <w:r>
+        <w:t xml:space="preserve"> CONSUMER · </w:t>
+      </w:r>
+      <w:r>
+        <w:rPr>
+          <w:b/>
+        </w:rPr>
         <w:t>Score:</w:t>
       </w:r>
       <w:r>
-        <w:t xml:space="preserve"> 10/14 (Fear 1, Heat 2, Track record 2, Breadth 1, Peg 2, Newness 1, Producibility 1) · </w:t>
+        <w:t xml:space="preserve"> 9/14 (Stakes 1, Heat 2, Track record 1, Breadth 1, Peg 2, Newness 1, Producibility 1) · </w:t>
       </w:r>
       <w:r>
         <w:rPr>
@@ -5201,7 +5464,7 @@
     </w:p>
     <w:p>
       <w:r>
-        <w:t>You pay the deposit and the project never starts. In Arizona, four Holtzman companies filed Chapter 7 owing about $8 million; one homeowner says she paid $122,000. The state fund caps recovery at $30,000 per homeowner. A company failure, not a scam, so it's a B at most.</w:t>
+        <w:t>You pay the deposit and the project never starts. In Arizona, four Holtzman companies filed Chapter 7 owing about $8 million; one homeowner says she paid $122,000. The state fund caps recovery at $30,000 per homeowner. No scammer here: a company failure, graded on the consumer track (Stakes 1: money you're owed). B/C at most.</w:t>
       </w:r>
     </w:p>
     <w:p>
@@ -5383,6 +5646,713 @@
       <w:r>
         <w:rPr>
           <w:color w:val="000000"/>
+          <w:sz w:val="32"/>
+        </w:rPr>
+        <w:t>14. STORES ARE KEEPING A FILE ON YOUR RETURNS</w:t>
+      </w:r>
+    </w:p>
+    <w:p>
+      <w:r>
+        <w:rPr>
+          <w:b/>
+        </w:rPr>
+        <w:t>Status:</w:t>
+      </w:r>
+      <w:r>
+        <w:t xml:space="preserve"> READY (needs a named shopper before air) · </w:t>
+      </w:r>
+      <w:r>
+        <w:rPr>
+          <w:b/>
+        </w:rPr>
+        <w:t>Track:</w:t>
+      </w:r>
+      <w:r>
+        <w:t xml:space="preserve"> CONSUMER · </w:t>
+      </w:r>
+      <w:r>
+        <w:rPr>
+          <w:b/>
+        </w:rPr>
+        <w:t>Score:</w:t>
+      </w:r>
+      <w:r>
+        <w:t xml:space="preserve"> 12/14 (Stakes 2, Heat 2, Track record 2, Breadth 2, Peg 1, Newness 1, Producibility 2) · </w:t>
+      </w:r>
+      <w:r>
+        <w:rPr>
+          <w:b/>
+        </w:rPr>
+        <w:t>Lead test:</w:t>
+      </w:r>
+      <w:r>
+        <w:t xml:space="preserve"> passes 1 of 3 (title) · </w:t>
+      </w:r>
+      <w:r>
+        <w:rPr>
+          <w:i/>
+        </w:rPr>
+        <w:t>JEFF'S CALL: not a scam</w:t>
+      </w:r>
+    </w:p>
+    <w:p>
+      <w:pPr>
+        <w:pStyle w:val="Heading3"/>
+      </w:pPr>
+      <w:r>
+        <w:rPr>
+          <w:color w:val="333333"/>
+          <w:sz w:val="22"/>
+        </w:rPr>
+        <w:t>POTENTIAL PACKAGING</w:t>
+      </w:r>
+    </w:p>
+    <w:p>
+      <w:pPr>
+        <w:pStyle w:val="ListBullet"/>
+        <w:spacing w:after="40"/>
+      </w:pPr>
+      <w:r>
+        <w:t>Stores Are BANNING You For THIS — Check Your Return File</w:t>
+      </w:r>
+    </w:p>
+    <w:p>
+      <w:pPr>
+        <w:pStyle w:val="ListBullet"/>
+        <w:spacing w:after="40"/>
+      </w:pPr>
+      <w:r>
+        <w:t>If THIS Prints on Your Receipt — You're Being TRACKED</w:t>
+      </w:r>
+    </w:p>
+    <w:p>
+      <w:pPr>
+        <w:pStyle w:val="ListBullet"/>
+        <w:spacing w:after="40"/>
+      </w:pPr>
+      <w:r>
+        <w:t>The Return That Gets You BANNED — What Stores Won't Tell You</w:t>
+      </w:r>
+    </w:p>
+    <w:p>
+      <w:r>
+        <w:rPr>
+          <w:b/>
+        </w:rPr>
+        <w:t>Built on:</w:t>
+      </w:r>
+      <w:r>
+        <w:t xml:space="preserve"> The TRUTH About Amazon Returns — They'll BAN You For This (443K, 3.8×); Amazon Will BAN You For THIS (2.3×).</w:t>
+      </w:r>
+    </w:p>
+    <w:p>
+      <w:pPr>
+        <w:pStyle w:val="Heading3"/>
+      </w:pPr>
+      <w:r>
+        <w:rPr>
+          <w:color w:val="333333"/>
+          <w:sz w:val="22"/>
+        </w:rPr>
+        <w:t>THE PITCH</w:t>
+      </w:r>
+    </w:p>
+    <w:p>
+      <w:r>
+        <w:t>You bring something back with the receipt, and the register says no. An outside company keeps a file on your returns and tells the store whether to take them. Shoppers complained this summer of refused or flagged returns. You can request your report and dispute it. Best pegged to post-holiday returns.</w:t>
+      </w:r>
+    </w:p>
+    <w:p>
+      <w:pPr>
+        <w:pStyle w:val="Heading3"/>
+      </w:pPr>
+      <w:r>
+        <w:rPr>
+          <w:color w:val="333333"/>
+          <w:sz w:val="22"/>
+        </w:rPr>
+        <w:t>CASES</w:t>
+      </w:r>
+    </w:p>
+    <w:p>
+      <w:pPr>
+        <w:pStyle w:val="ListBullet"/>
+        <w:spacing w:after="40"/>
+      </w:pPr>
+      <w:r>
+        <w:rPr>
+          <w:b/>
+        </w:rPr>
+        <w:t>Meijer (August 2026).</w:t>
+      </w:r>
+      <w:r>
+        <w:t xml:space="preserve"> A return of seven sweatshirts ($209.93) was refused through The Retail Equation; the shopper disputes the reason given. </w:t>
+      </w:r>
+      <w:r>
+        <w:rPr>
+          <w:i/>
+        </w:rPr>
+        <w:t>BBB complaint, filed Aug 10, 2026.</w:t>
+      </w:r>
+      <w:r>
+        <w:t xml:space="preserve"> CHECK: anonymous first-person complaint, not news.</w:t>
+      </w:r>
+    </w:p>
+    <w:p>
+      <w:pPr>
+        <w:pStyle w:val="ListBullet"/>
+        <w:spacing w:after="40"/>
+      </w:pPr>
+      <w:r>
+        <w:rPr>
+          <w:b/>
+        </w:rPr>
+        <w:t>Store not named (January 2026).</w:t>
+      </w:r>
+      <w:r>
+        <w:t xml:space="preserve"> A $49.08 return was refused under a "TRE restriction"; the appeal went unanswered. </w:t>
+      </w:r>
+      <w:r>
+        <w:rPr>
+          <w:i/>
+        </w:rPr>
+        <w:t>BBB complaint, Jun 27, 2026.</w:t>
+      </w:r>
+      <w:r>
+        <w:t xml:space="preserve"> More complaints Sep 1 and Sep 12.</w:t>
+      </w:r>
+    </w:p>
+    <w:p>
+      <w:pPr>
+        <w:pStyle w:val="ListBullet"/>
+        <w:spacing w:after="40"/>
+      </w:pPr>
+      <w:r>
+        <w:rPr>
+          <w:b/>
+        </w:rPr>
+        <w:t>The company's own policy.</w:t>
+      </w:r>
+      <w:r>
+        <w:t xml:space="preserve"> The Retail Equation gives stores an approve, warn or deny call, and shoppers can request their report. </w:t>
+      </w:r>
+      <w:r>
+        <w:rPr>
+          <w:i/>
+        </w:rPr>
+        <w:t>theretailequation.com; CFPB list.</w:t>
+      </w:r>
+    </w:p>
+    <w:p>
+      <w:pPr>
+        <w:spacing w:before="80" w:after="120"/>
+        <w:pBdr>
+          <w:top w:val="single" w:sz="4" w:space="6" w:color="E8710A"/>
+          <w:left w:val="single" w:sz="24" w:space="6" w:color="E8710A"/>
+          <w:bottom w:val="single" w:sz="4" w:space="6" w:color="E8710A"/>
+          <w:right w:val="single" w:sz="4" w:space="6" w:color="E8710A"/>
+        </w:pBdr>
+        <w:shd w:val="clear" w:color="auto" w:fill="FCE4CC"/>
+      </w:pPr>
+      <w:r>
+        <w:rPr>
+          <w:b/>
+        </w:rPr>
+        <w:t>VIRAL CLIP</w:t>
+      </w:r>
+      <w:r>
+        <w:t xml:space="preserve"> — YouTube, CNBC, 2,291,298 views (observed Oct 28), upload date unconfirmed (a text copy is dated May 10, 2024)</w:t>
+      </w:r>
+      <w:r>
+        <w:br/>
+      </w:r>
+      <w:r>
+        <w:t>https://www.youtube.com/watch?v=XZemo1KVQMA</w:t>
+      </w:r>
+      <w:r>
+        <w:br/>
+      </w:r>
+      <w:r>
+        <w:t>"How Retailers Like T.J. Maxx And Home Depot Quietly Target 'Problem' Returners."</w:t>
+      </w:r>
+      <w:r>
+        <w:br/>
+      </w:r>
+      <w:r>
+        <w:rPr>
+          <w:i/>
+        </w:rPr>
+        <w:t>Not watched — no timecode, no outcue.</w:t>
+      </w:r>
+    </w:p>
+    <w:p>
+      <w:pPr>
+        <w:pStyle w:val="Heading3"/>
+      </w:pPr>
+      <w:r>
+        <w:rPr>
+          <w:color w:val="333333"/>
+          <w:sz w:val="22"/>
+        </w:rPr>
+        <w:t>COVERAGE CHECK</w:t>
+      </w:r>
+    </w:p>
+    <w:p>
+      <w:r>
+        <w:t>The transcripts have no Retail Equation mention. Amazon return bans aired Nov 2025, Mar 20 and Apr 24 (Keep-It); this is walk-in stores and an outside company, the same theme with a different mechanism. Not in the Oct 25 rounds.</w:t>
+      </w:r>
+    </w:p>
+    <w:p>
+      <w:pPr>
+        <w:pStyle w:val="Heading3"/>
+      </w:pPr>
+      <w:r>
+        <w:rPr>
+          <w:color w:val="333333"/>
+          <w:sz w:val="22"/>
+        </w:rPr>
+        <w:t>FOOTAGE WE NEED</w:t>
+      </w:r>
+    </w:p>
+    <w:p>
+      <w:pPr>
+        <w:pStyle w:val="ListBullet"/>
+        <w:spacing w:after="40"/>
+      </w:pPr>
+      <w:r>
+        <w:rPr>
+          <w:b/>
+        </w:rPr>
+        <w:t>The get:</w:t>
+      </w:r>
+      <w:r>
+        <w:t xml:space="preserve"> CNBC's package, and a shopper on camera (none found yet).</w:t>
+      </w:r>
+    </w:p>
+    <w:p>
+      <w:pPr>
+        <w:pStyle w:val="ListBullet"/>
+        <w:spacing w:after="40"/>
+      </w:pPr>
+      <w:r>
+        <w:t xml:space="preserve">Jeff requests his own Return Activity Report. </w:t>
+      </w:r>
+      <w:r>
+        <w:rPr>
+          <w:i/>
+        </w:rPr>
+        <w:t>(demo)</w:t>
+      </w:r>
+    </w:p>
+    <w:p>
+      <w:pPr>
+        <w:pStyle w:val="Heading3"/>
+      </w:pPr>
+      <w:r>
+        <w:rPr>
+          <w:color w:val="333333"/>
+          <w:sz w:val="22"/>
+        </w:rPr>
+        <w:t>THE PAYOFF</w:t>
+      </w:r>
+    </w:p>
+    <w:p>
+      <w:pPr>
+        <w:pStyle w:val="ListBullet"/>
+        <w:spacing w:after="40"/>
+      </w:pPr>
+      <w:r>
+        <w:rPr>
+          <w:b/>
+        </w:rPr>
+        <w:t>Warned or refused at the register? Request your Return Activity Report and dispute anything wrong.</w:t>
+      </w:r>
+      <w:r>
+        <w:t xml:space="preserve"> (800) 652-2331, consumerinquiry@theretailequation.com. </w:t>
+      </w:r>
+      <w:r>
+        <w:rPr>
+          <w:i/>
+        </w:rPr>
+        <w:t>(CFPB list and TRE site; verify before air)</w:t>
+      </w:r>
+    </w:p>
+    <w:p>
+      <w:pPr>
+        <w:pStyle w:val="ListBullet"/>
+        <w:spacing w:after="40"/>
+      </w:pPr>
+      <w:r>
+        <w:t>Keep the receipt; the online request needs its transaction ID within 60 days.</w:t>
+      </w:r>
+    </w:p>
+    <w:p>
+      <w:r>
+        <w:br w:type="page"/>
+      </w:r>
+    </w:p>
+    <w:p>
+      <w:pPr>
+        <w:pStyle w:val="Heading1"/>
+      </w:pPr>
+      <w:r>
+        <w:rPr>
+          <w:color w:val="000000"/>
+          <w:sz w:val="32"/>
+        </w:rPr>
+        <w:t>15. THE "FREE" PHONE THAT COST $1,200</w:t>
+      </w:r>
+    </w:p>
+    <w:p>
+      <w:r>
+        <w:rPr>
+          <w:b/>
+        </w:rPr>
+        <w:t>Status:</w:t>
+      </w:r>
+      <w:r>
+        <w:t xml:space="preserve"> READY · </w:t>
+      </w:r>
+      <w:r>
+        <w:rPr>
+          <w:b/>
+        </w:rPr>
+        <w:t>Track:</w:t>
+      </w:r>
+      <w:r>
+        <w:t xml:space="preserve"> CONSUMER · </w:t>
+      </w:r>
+      <w:r>
+        <w:rPr>
+          <w:b/>
+        </w:rPr>
+        <w:t>Score:</w:t>
+      </w:r>
+      <w:r>
+        <w:t xml:space="preserve"> 11/14 (Stakes 2, Heat 1, Track record 1, Breadth 2, Peg 2, Newness 1, Producibility 2) · </w:t>
+      </w:r>
+      <w:r>
+        <w:rPr>
+          <w:b/>
+        </w:rPr>
+        <w:t>Lead test:</w:t>
+      </w:r>
+      <w:r>
+        <w:t xml:space="preserve"> passes 2 of 3 (stop-and-check, title) · </w:t>
+      </w:r>
+      <w:r>
+        <w:rPr>
+          <w:i/>
+        </w:rPr>
+        <w:t>JEFF'S CALL: not a scam</w:t>
+      </w:r>
+    </w:p>
+    <w:p>
+      <w:pPr>
+        <w:pStyle w:val="Heading3"/>
+      </w:pPr>
+      <w:r>
+        <w:rPr>
+          <w:color w:val="333333"/>
+          <w:sz w:val="22"/>
+        </w:rPr>
+        <w:t>POTENTIAL PACKAGING</w:t>
+      </w:r>
+    </w:p>
+    <w:p>
+      <w:pPr>
+        <w:pStyle w:val="ListBullet"/>
+        <w:spacing w:after="40"/>
+      </w:pPr>
+      <w:r>
+        <w:t>The FREE Phone Deal — THEN Came a $1,200 Bill</w:t>
+      </w:r>
+    </w:p>
+    <w:p>
+      <w:pPr>
+        <w:pStyle w:val="ListBullet"/>
+        <w:spacing w:after="40"/>
+      </w:pPr>
+      <w:r>
+        <w:t>Check Your Phone Bill For THIS — Your "Free" Phone ISN'T Free</w:t>
+      </w:r>
+    </w:p>
+    <w:p>
+      <w:pPr>
+        <w:pStyle w:val="ListBullet"/>
+        <w:spacing w:after="40"/>
+      </w:pPr>
+      <w:r>
+        <w:t>Your Carrier Charged You For a Phone You SENT BACK</w:t>
+      </w:r>
+    </w:p>
+    <w:p>
+      <w:r>
+        <w:rPr>
+          <w:b/>
+        </w:rPr>
+        <w:t>Built on:</w:t>
+      </w:r>
+      <w:r>
+        <w:t xml:space="preserve"> The Amazon Fee HITTING Prime Accounts — You're Paying TWICE! (229K).</w:t>
+      </w:r>
+    </w:p>
+    <w:p>
+      <w:pPr>
+        <w:pStyle w:val="Heading3"/>
+      </w:pPr>
+      <w:r>
+        <w:rPr>
+          <w:color w:val="333333"/>
+          <w:sz w:val="22"/>
+        </w:rPr>
+        <w:t>THE PITCH</w:t>
+      </w:r>
+    </w:p>
+    <w:p>
+      <w:r>
+        <w:t>The carrier says the new phone is free. Then the credit disappears, or the phone you sent back gets "lost," and you're billed $1,200. Black Friday phone deals start in three weeks. Viewers can check tonight: look at the bill for the promo credit they were promised.</w:t>
+      </w:r>
+    </w:p>
+    <w:p>
+      <w:pPr>
+        <w:pStyle w:val="Heading3"/>
+      </w:pPr>
+      <w:r>
+        <w:rPr>
+          <w:color w:val="333333"/>
+          <w:sz w:val="22"/>
+        </w:rPr>
+        <w:t>CASES</w:t>
+      </w:r>
+    </w:p>
+    <w:p>
+      <w:pPr>
+        <w:pStyle w:val="ListBullet"/>
+        <w:spacing w:after="40"/>
+      </w:pPr>
+      <w:r>
+        <w:rPr>
+          <w:b/>
+        </w:rPr>
+        <w:t>Kansas (Feb 2026).</w:t>
+      </w:r>
+      <w:r>
+        <w:t xml:space="preserve"> Steve Crawford was offered a free iPhone 16 upgrade, was told the promo had ended, and shipped the phone back with tracking. AT&amp;T billed him nearly $1,200 for a "lost" phone, then refunded it after KMBC stepped in: "We acknowledged that we fell short." </w:t>
+      </w:r>
+      <w:r>
+        <w:rPr>
+          <w:i/>
+        </w:rPr>
+        <w:t>KMBC 9, Feb 3, 2026.</w:t>
+      </w:r>
+      <w:r>
+        <w:t xml:space="preserve"> CHECK: kmbc.com blocks this container; confirm the page.</w:t>
+      </w:r>
+    </w:p>
+    <w:p>
+      <w:pPr>
+        <w:pStyle w:val="ListBullet"/>
+        <w:spacing w:after="40"/>
+      </w:pPr>
+      <w:r>
+        <w:rPr>
+          <w:b/>
+        </w:rPr>
+        <w:t>T-Mobile (April 2026).</w:t>
+      </w:r>
+      <w:r>
+        <w:t xml:space="preserve"> A customer was promised three iPhone 17 Pros for $0 and was credited only a few hundred dollars; unresolved. </w:t>
+      </w:r>
+      <w:r>
+        <w:rPr>
+          <w:i/>
+        </w:rPr>
+        <w:t>TmoNews citing PhoneArena, Apr 17, 2026.</w:t>
+      </w:r>
+    </w:p>
+    <w:p>
+      <w:pPr>
+        <w:pStyle w:val="ListBullet"/>
+        <w:spacing w:after="40"/>
+      </w:pPr>
+      <w:r>
+        <w:rPr>
+          <w:b/>
+        </w:rPr>
+        <w:t>Pottstown, PA (Sept 2025).</w:t>
+      </w:r>
+      <w:r>
+        <w:t xml:space="preserve"> Billed for a "free" Xfinity Mobile Apple Watch; Comcast dropped $237. </w:t>
+      </w:r>
+      <w:r>
+        <w:rPr>
+          <w:i/>
+        </w:rPr>
+        <w:t>CBS Philadelphia, Sep 19, 2025.</w:t>
+      </w:r>
+    </w:p>
+    <w:p>
+      <w:pPr>
+        <w:spacing w:before="80" w:after="120"/>
+        <w:pBdr>
+          <w:top w:val="single" w:sz="4" w:space="6" w:color="999999"/>
+          <w:left w:val="single" w:sz="24" w:space="6" w:color="999999"/>
+          <w:bottom w:val="single" w:sz="4" w:space="6" w:color="999999"/>
+          <w:right w:val="single" w:sz="4" w:space="6" w:color="999999"/>
+        </w:pBdr>
+        <w:shd w:val="clear" w:color="auto" w:fill="EDEDED"/>
+      </w:pPr>
+      <w:r>
+        <w:rPr>
+          <w:b/>
+        </w:rPr>
+        <w:t>CLIP</w:t>
+      </w:r>
+      <w:r>
+        <w:t xml:space="preserve"> — YouTube, KMBC 9, 47,432 views (observed Oct 28), video dated Feb 4, 2026 on KMBC's page</w:t>
+      </w:r>
+      <w:r>
+        <w:br/>
+      </w:r>
+      <w:r>
+        <w:t>https://www.youtube.com/watch?v=PeUvfRhTVCw</w:t>
+      </w:r>
+      <w:r>
+        <w:br/>
+      </w:r>
+      <w:r>
+        <w:t>"Kansas AT&amp;T customer charged nearly $1,200 after returning iPhone despite proof of shipment." Also WCVB "free" T-Mobile offer, 163,174 (Z31mP2YXapM), and NBC10, 130,333 (227BkcYfTxo); both dates unconfirmed.</w:t>
+      </w:r>
+      <w:r>
+        <w:br/>
+      </w:r>
+      <w:r>
+        <w:rPr>
+          <w:i/>
+        </w:rPr>
+        <w:t>Not watched — no timecode, no outcue.</w:t>
+      </w:r>
+    </w:p>
+    <w:p>
+      <w:pPr>
+        <w:pStyle w:val="Heading3"/>
+      </w:pPr>
+      <w:r>
+        <w:rPr>
+          <w:color w:val="333333"/>
+          <w:sz w:val="22"/>
+        </w:rPr>
+        <w:t>COVERAGE CHECK</w:t>
+      </w:r>
+    </w:p>
+    <w:p>
+      <w:r>
+        <w:t>Never covered (promo, bill credit, trade-in). Sep 25 ("Don't Return THIS Package") was a fake-carrier scam; this is the real carrier's billing.</w:t>
+      </w:r>
+    </w:p>
+    <w:p>
+      <w:pPr>
+        <w:pStyle w:val="Heading3"/>
+      </w:pPr>
+      <w:r>
+        <w:rPr>
+          <w:color w:val="333333"/>
+          <w:sz w:val="22"/>
+        </w:rPr>
+        <w:t>FOOTAGE WE NEED</w:t>
+      </w:r>
+    </w:p>
+    <w:p>
+      <w:pPr>
+        <w:pStyle w:val="ListBullet"/>
+        <w:spacing w:after="40"/>
+      </w:pPr>
+      <w:r>
+        <w:rPr>
+          <w:b/>
+        </w:rPr>
+        <w:t>The get:</w:t>
+      </w:r>
+      <w:r>
+        <w:t xml:space="preserve"> KMBC's package, or WCVB or NBC10 if their dates check out.</w:t>
+      </w:r>
+    </w:p>
+    <w:p>
+      <w:pPr>
+        <w:pStyle w:val="ListBullet"/>
+        <w:spacing w:after="40"/>
+      </w:pPr>
+      <w:r>
+        <w:t xml:space="preserve">Jeff reads a real promo's fine print: 36 months of credits that stop if you leave. </w:t>
+      </w:r>
+      <w:r>
+        <w:rPr>
+          <w:i/>
+        </w:rPr>
+        <w:t>(demo)</w:t>
+      </w:r>
+    </w:p>
+    <w:p>
+      <w:pPr>
+        <w:pStyle w:val="Heading3"/>
+      </w:pPr>
+      <w:r>
+        <w:rPr>
+          <w:color w:val="333333"/>
+          <w:sz w:val="22"/>
+        </w:rPr>
+        <w:t>THE PAYOFF</w:t>
+      </w:r>
+    </w:p>
+    <w:p>
+      <w:pPr>
+        <w:pStyle w:val="ListBullet"/>
+        <w:spacing w:after="40"/>
+      </w:pPr>
+      <w:r>
+        <w:rPr>
+          <w:b/>
+        </w:rPr>
+        <w:t>Screenshot the deal's terms before you say yes, and check your next two bills for the credit.</w:t>
+      </w:r>
+    </w:p>
+    <w:p>
+      <w:pPr>
+        <w:pStyle w:val="ListBullet"/>
+        <w:spacing w:after="40"/>
+      </w:pPr>
+      <w:r>
+        <w:t>Return a phone only with tracking and insurance, and keep the receipt.</w:t>
+      </w:r>
+    </w:p>
+    <w:p>
+      <w:pPr>
+        <w:pStyle w:val="ListBullet"/>
+        <w:spacing w:after="40"/>
+      </w:pPr>
+      <w:r>
+        <w:t xml:space="preserve">Billed anyway? Dispute it in writing, then file with the FCC. </w:t>
+      </w:r>
+      <w:r>
+        <w:rPr>
+          <w:i/>
+        </w:rPr>
+        <w:t>(verify)</w:t>
+      </w:r>
+    </w:p>
+    <w:p>
+      <w:r>
+        <w:br w:type="page"/>
+      </w:r>
+    </w:p>
+    <w:p>
+      <w:pPr>
+        <w:pStyle w:val="Heading1"/>
+      </w:pPr>
+      <w:r>
+        <w:rPr>
+          <w:color w:val="000000"/>
         </w:rPr>
         <w:t>RESEARCH SOURCES &amp; VERIFICATION FLAGS</w:t>
       </w:r>
@@ -6041,6 +7011,96 @@
           <w:color w:val="000000"/>
           <w:sz w:val="26"/>
         </w:rPr>
+        <w:t>STORY 14 — RETURN FILES</w:t>
+      </w:r>
+    </w:p>
+    <w:p>
+      <w:r>
+        <w:rPr>
+          <w:b/>
+        </w:rPr>
+        <w:t>Confirmed:</w:t>
+      </w:r>
+      <w:r>
+        <w:t xml:space="preserve"> CFPB lists The Retail Equation as a consumer reporting company (returns), with a free report: (800) 652-2331, P.O. Box 51373, Irvine, CA (v). TRE's site: approve, warn or deny recommendations; Return Activity Report requests within 60 days of the transaction, or by email (v).</w:t>
+      </w:r>
+    </w:p>
+    <w:p>
+      <w:r>
+        <w:rPr>
+          <w:b/>
+        </w:rPr>
+        <w:t>Sources:</w:t>
+      </w:r>
+      <w:r>
+        <w:t xml:space="preserve"> https://www.consumerfinance.gov/consumer-tools/credit-reports-and-scores/consumer-reporting-companies/companies-list/retail-equation/ · https://www.theretailequation.com/ · BBB complaints: https://www.bbb.org/us/ca/irvine/profile/point-of-sale-systems/the-retail-equation-1126-13140940/complaints · Appriss benchmark (reported Feb 20, 2026) · NY S2440 (re-referred Jan 7, 2026)</w:t>
+      </w:r>
+    </w:p>
+    <w:p>
+      <w:r>
+        <w:rPr>
+          <w:b/>
+        </w:rPr>
+        <w:t>NEEDS VERIFICATION:</w:t>
+      </w:r>
+      <w:r>
+        <w:t xml:space="preserve"> CHECK: no named shopper in news coverage from the last 12 months; the cases are anonymous BBB complaints (research pass). CHECK: the CNBC clip's upload date. LEGAL: don't imply one shared blacklist across stores, or any credit-score effect. Name a store only if a source names it.</w:t>
+      </w:r>
+    </w:p>
+    <w:p>
+      <w:pPr>
+        <w:pStyle w:val="Heading2"/>
+      </w:pPr>
+      <w:r>
+        <w:rPr>
+          <w:color w:val="000000"/>
+          <w:sz w:val="26"/>
+        </w:rPr>
+        <w:t>STORY 15 — "FREE" PHONE BILL</w:t>
+      </w:r>
+    </w:p>
+    <w:p>
+      <w:r>
+        <w:rPr>
+          <w:b/>
+        </w:rPr>
+        <w:t>Confirmed (research pass):</w:t>
+      </w:r>
+      <w:r>
+        <w:t xml:space="preserve"> KMBC Feb 3, 2026, the Crawford case and AT&amp;T's statement. TmoNews Apr 17, 2026. CBS Philadelphia Sep 19, 2025.</w:t>
+      </w:r>
+    </w:p>
+    <w:p>
+      <w:r>
+        <w:rPr>
+          <w:b/>
+        </w:rPr>
+        <w:t>Sources:</w:t>
+      </w:r>
+      <w:r>
+        <w:t xml:space="preserve"> https://www.kmbc.com/article/kmbc-9-investigates-helps-kansas-man-after-att-iphone-promotion-leads-to-1200-charge/70239515 · https://www.tmonews.com/?p=59525</w:t>
+      </w:r>
+    </w:p>
+    <w:p>
+      <w:r>
+        <w:rPr>
+          <w:b/>
+        </w:rPr>
+        <w:t>NEEDS VERIFICATION:</w:t>
+      </w:r>
+      <w:r>
+        <w:t xml:space="preserve"> CHECK: I couldn't open KMBC from here. CHECK: the WCVB and NBC10 clip dates and stories. Every case was refunded or credited, so say "billed," not "lost."</w:t>
+      </w:r>
+    </w:p>
+    <w:p>
+      <w:pPr>
+        <w:pStyle w:val="Heading2"/>
+      </w:pPr>
+      <w:r>
+        <w:rPr>
+          <w:color w:val="000000"/>
+          <w:sz w:val="26"/>
+        </w:rPr>
         <w:t>STORIES CUT — SOURCING PRESERVED</w:t>
       </w:r>
     </w:p>
@@ -6286,7 +7346,7 @@
         <w:spacing w:after="40"/>
       </w:pPr>
       <w:r>
-        <w:t>Hotel reseller sites (from your file): no 9NEWS video found. The Medina couple was refunded; the unrefunded case is Australian.</w:t>
+        <w:t>Bank courier for your card (clips under 2K).</w:t>
       </w:r>
     </w:p>
     <w:p>
@@ -6295,7 +7355,7 @@
         <w:spacing w:after="40"/>
       </w:pPr>
       <w:r>
-        <w:t>AT&amp;T free-phone bill (from your file): no clip found; KMBC wouldn't load. Also next to the Sep 25 phone-return show.</w:t>
+        <w:t>Bank-merger phishing.</w:t>
       </w:r>
     </w:p>
     <w:p>
@@ -6304,7 +7364,7 @@
         <w:spacing w:after="40"/>
       </w:pPr>
       <w:r>
-        <w:t>Bank courier for your card (clips under 2K).</w:t>
+        <w:t>Fake data-breach letters.</w:t>
       </w:r>
     </w:p>
     <w:p>
@@ -6313,7 +7373,7 @@
         <w:spacing w:after="40"/>
       </w:pPr>
       <w:r>
-        <w:t>Bank-merger phishing.</w:t>
+        <w:t>Streaming suspension emails.</w:t>
       </w:r>
     </w:p>
     <w:p>
@@ -6322,7 +7382,7 @@
         <w:spacing w:after="40"/>
       </w:pPr>
       <w:r>
-        <w:t>Fake data-breach letters.</w:t>
+        <w:t>Failing CO alarms sold online: CPSC Aug 20; a near-miss that needs a local package.</w:t>
       </w:r>
     </w:p>
     <w:p>
@@ -6331,7 +7391,7 @@
         <w:spacing w:after="40"/>
       </w:pPr>
       <w:r>
-        <w:t>Streaming suspension emails.</w:t>
+        <w:t>IRS impostors.</w:t>
       </w:r>
     </w:p>
     <w:p>
@@ -6340,7 +7400,15 @@
         <w:spacing w:after="40"/>
       </w:pPr>
       <w:r>
-        <w:t>Failing CO alarms sold online: CPSC Aug 20; a near-miss that needs a local package.</w:t>
+        <w:t>Military funeral honors (also H1).</w:t>
+      </w:r>
+    </w:p>
+    <w:p>
+      <w:r>
+        <w:rPr>
+          <w:b/>
+        </w:rPr>
+        <w:t>Not happening now (H2):</w:t>
       </w:r>
     </w:p>
     <w:p>
@@ -6349,7 +7417,7 @@
         <w:spacing w:after="40"/>
       </w:pPr>
       <w:r>
-        <w:t>IRS impostors.</w:t>
+        <w:t>Medical-alert scams.</w:t>
       </w:r>
     </w:p>
     <w:p>
@@ -6358,7 +7426,7 @@
         <w:spacing w:after="40"/>
       </w:pPr>
       <w:r>
-        <w:t>Military funeral honors (also H1).</w:t>
+        <w:t>Authorized user on its own (2024; folded into #2).</w:t>
       </w:r>
     </w:p>
     <w:p>
@@ -6366,7 +7434,7 @@
         <w:rPr>
           <w:b/>
         </w:rPr>
-        <w:t>Not happening now (H2):</w:t>
+        <w:t>No villain, or the viewer isn't the target (H1):</w:t>
       </w:r>
     </w:p>
     <w:p>
@@ -6375,7 +7443,7 @@
         <w:spacing w:after="40"/>
       </w:pPr>
       <w:r>
-        <w:t>Store return-tracking files (from your file): newest coverage 2018–2020; no 2025–26 case. Gets over with a 2026 shopper denied and a package.</w:t>
+        <w:t>Airline bump payouts (from your file): a perk, and it fails consumer H1 too.</w:t>
       </w:r>
     </w:p>
     <w:p>
@@ -6384,7 +7452,7 @@
         <w:spacing w:after="40"/>
       </w:pPr>
       <w:r>
-        <w:t>Hotel sheets (from your file): newest investigation 2020. Also H1: no villain.</w:t>
+        <w:t>Recalled heated blankets.</w:t>
       </w:r>
     </w:p>
     <w:p>
@@ -6393,7 +7461,7 @@
         <w:spacing w:after="40"/>
       </w:pPr>
       <w:r>
-        <w:t>Medical-alert scams.</w:t>
+        <w:t>Tristar pressure cooker.</w:t>
       </w:r>
     </w:p>
     <w:p>
@@ -6402,15 +7470,7 @@
         <w:spacing w:after="40"/>
       </w:pPr>
       <w:r>
-        <w:t>Authorized user on its own (2024; folded into #2).</w:t>
-      </w:r>
-    </w:p>
-    <w:p>
-      <w:r>
-        <w:rPr>
-          <w:b/>
-        </w:rPr>
-        <w:t>No villain, or the viewer isn't the target (H1):</w:t>
+        <w:t>iOS 27 settings and "stop taking screenshots": settings tips with no villain.</w:t>
       </w:r>
     </w:p>
     <w:p>
@@ -6419,7 +7479,15 @@
         <w:spacing w:after="40"/>
       </w:pPr>
       <w:r>
-        <w:t>Airline bump payouts (from your file): a perk, not a scam.</w:t>
+        <w:t>Hospice fraud as a taxpayer story.</w:t>
+      </w:r>
+    </w:p>
+    <w:p>
+      <w:r>
+        <w:rPr>
+          <w:b/>
+        </w:rPr>
+        <w:t>Off the list:</w:t>
       </w:r>
     </w:p>
     <w:p>
@@ -6428,7 +7496,15 @@
         <w:spacing w:after="40"/>
       </w:pPr>
       <w:r>
-        <w:t>Recalled heated blankets.</w:t>
+        <w:t>Thanksgiving dinner prices (from your file): a price comparison, which fails consumer H1. Not killed: it belongs in the Friday deals block (Nov 20 or 27), with Jeff shopping the baskets himself.</w:t>
+      </w:r>
+    </w:p>
+    <w:p>
+      <w:r>
+        <w:rPr>
+          <w:b/>
+        </w:rPr>
+        <w:t>Consumer track, failed (Oct 28 re-grade):</w:t>
       </w:r>
     </w:p>
     <w:p>
@@ -6437,7 +7513,7 @@
         <w:spacing w:after="40"/>
       </w:pPr>
       <w:r>
-        <w:t>Tristar pressure cooker.</w:t>
+        <w:t>Hotel reseller sites (from your file): travel-only fails consumer H1; also H6 (no clip found; the Medina couple was refunded; the unrefunded case is Australian).</w:t>
       </w:r>
     </w:p>
     <w:p>
@@ -6446,7 +7522,7 @@
         <w:spacing w:after="40"/>
       </w:pPr>
       <w:r>
-        <w:t>iOS 27 settings and "stop taking screenshots": settings tips with no villain.</w:t>
+        <w:t>Hotel sheets not changed (from your file): travel-only fails H1; H2 (newest investigation 2020).</w:t>
       </w:r>
     </w:p>
     <w:p>
@@ -6455,7 +7531,7 @@
         <w:spacing w:after="40"/>
       </w:pPr>
       <w:r>
-        <w:t>Hospice fraud as a taxpayer story.</w:t>
+        <w:t>Prime refunds.</w:t>
       </w:r>
     </w:p>
     <w:p>
@@ -6463,7 +7539,7 @@
         <w:rPr>
           <w:b/>
         </w:rPr>
-        <w:t>Off the list:</w:t>
+        <w:t>Niche (H1):</w:t>
       </w:r>
     </w:p>
     <w:p>
@@ -6472,7 +7548,61 @@
         <w:spacing w:after="40"/>
       </w:pPr>
       <w:r>
-        <w:t>Thanksgiving dinner prices (from your file): price comparison, Friday deals slot only.</w:t>
+        <w:t>Obituary burglars: family_death, per your Oct 25 verdict.</w:t>
+      </w:r>
+    </w:p>
+    <w:p>
+      <w:pPr>
+        <w:pStyle w:val="Heading2"/>
+      </w:pPr>
+      <w:r>
+        <w:rPr>
+          <w:color w:val="000000"/>
+          <w:sz w:val="26"/>
+        </w:rPr>
+        <w:t>OPEN QUESTIONS FOR THE MEETING</w:t>
+      </w:r>
+    </w:p>
+    <w:p>
+      <w:pPr>
+        <w:pStyle w:val="ListNumber"/>
+        <w:spacing w:after="40"/>
+      </w:pPr>
+      <w:r>
+        <w:rPr>
+          <w:b/>
+        </w:rPr>
+        <w:t>F1 lead:</w:t>
+      </w:r>
+      <w:r>
+        <w:t xml:space="preserve"> #1, the cameras (Ring ties to Friday)?</w:t>
+      </w:r>
+    </w:p>
+    <w:p>
+      <w:pPr>
+        <w:pStyle w:val="ListNumber"/>
+        <w:spacing w:after="40"/>
+      </w:pPr>
+      <w:r>
+        <w:rPr>
+          <w:b/>
+        </w:rPr>
+        <w:t>F2 A:</w:t>
+      </w:r>
+      <w:r>
+        <w:t xml:space="preserve"> #2, the $2 charge, or #3, fake cops?</w:t>
+      </w:r>
+    </w:p>
+    <w:p>
+      <w:pPr>
+        <w:pStyle w:val="ListNumber"/>
+        <w:spacing w:after="40"/>
+      </w:pPr>
+      <w:r>
+        <w:rPr>
+          <w:b/>
+        </w:rPr>
+        <w:t>Collisions:</w:t>
       </w:r>
     </w:p>
     <w:p>
@@ -6481,15 +7611,7 @@
         <w:spacing w:after="40"/>
       </w:pPr>
       <w:r>
-        <w:t>Prime refunds.</w:t>
-      </w:r>
-    </w:p>
-    <w:p>
-      <w:r>
-        <w:rPr>
-          <w:b/>
-        </w:rPr>
-        <w:t>Niche (H1):</w:t>
+        <w:t>#6 vs. the pending furnace scare.</w:t>
       </w:r>
     </w:p>
     <w:p>
@@ -6498,19 +7620,25 @@
         <w:spacing w:after="40"/>
       </w:pPr>
       <w:r>
-        <w:t>Obituary burglars: family_death, per your Oct 25 verdict.</w:t>
-      </w:r>
-    </w:p>
-    <w:p>
-      <w:pPr>
-        <w:pStyle w:val="Heading2"/>
-      </w:pPr>
-      <w:r>
-        <w:rPr>
-          <w:color w:val="000000"/>
-          <w:sz w:val="26"/>
-        </w:rPr>
-        <w:t>OPEN QUESTIONS FOR THE MEETING</w:t>
+        <w:t>#10 vs. gold couriers.</w:t>
+      </w:r>
+    </w:p>
+    <w:p>
+      <w:pPr>
+        <w:pStyle w:val="ListBullet"/>
+        <w:spacing w:after="40"/>
+      </w:pPr>
+      <w:r>
+        <w:t>#9 vs. the Oct 7 face-match A.</w:t>
+      </w:r>
+    </w:p>
+    <w:p>
+      <w:pPr>
+        <w:pStyle w:val="ListBullet"/>
+        <w:spacing w:after="40"/>
+      </w:pPr>
+      <w:r>
+        <w:t>#5 vs. the Oct 9 Medicare show.</w:t>
       </w:r>
     </w:p>
     <w:p>
@@ -6522,10 +7650,10 @@
         <w:rPr>
           <w:b/>
         </w:rPr>
-        <w:t>F1 lead:</w:t>
-      </w:r>
-      <w:r>
-        <w:t xml:space="preserve"> #1, the cameras (Ring ties to Friday)?</w:t>
+        <w:t>Filmed since Oct 25</w:t>
+      </w:r>
+      <w:r>
+        <w:t xml:space="preserve"> that I can't see?</w:t>
       </w:r>
     </w:p>
     <w:p>
@@ -6537,10 +7665,10 @@
         <w:rPr>
           <w:b/>
         </w:rPr>
-        <w:t>F2 A:</w:t>
-      </w:r>
-      <w:r>
-        <w:t xml:space="preserve"> #2, the $2 charge, or #3, fake cops?</w:t>
+        <w:t>Street crime:</w:t>
+      </w:r>
+      <w:r>
+        <w:t xml:space="preserve"> do #4 and #7 pitch at all, given the "blue collar crime" note?</w:t>
       </w:r>
     </w:p>
     <w:p>
@@ -6552,73 +7680,10 @@
         <w:rPr>
           <w:b/>
         </w:rPr>
-        <w:t>Collisions:</w:t>
-      </w:r>
-    </w:p>
-    <w:p>
-      <w:pPr>
-        <w:pStyle w:val="ListBullet"/>
-        <w:spacing w:after="40"/>
-      </w:pPr>
-      <w:r>
-        <w:t>#6 vs. the pending furnace scare.</w:t>
-      </w:r>
-    </w:p>
-    <w:p>
-      <w:pPr>
-        <w:pStyle w:val="ListBullet"/>
-        <w:spacing w:after="40"/>
-      </w:pPr>
-      <w:r>
-        <w:t>#10 vs. gold couriers.</w:t>
-      </w:r>
-    </w:p>
-    <w:p>
-      <w:pPr>
-        <w:pStyle w:val="ListBullet"/>
-        <w:spacing w:after="40"/>
-      </w:pPr>
-      <w:r>
-        <w:t>#9 vs. the Oct 7 face-match A.</w:t>
-      </w:r>
-    </w:p>
-    <w:p>
-      <w:pPr>
-        <w:pStyle w:val="ListBullet"/>
-        <w:spacing w:after="40"/>
-      </w:pPr>
-      <w:r>
-        <w:t>#5 vs. the Oct 9 Medicare show.</w:t>
-      </w:r>
-    </w:p>
-    <w:p>
-      <w:pPr>
-        <w:pStyle w:val="ListNumber"/>
-        <w:spacing w:after="40"/>
-      </w:pPr>
-      <w:r>
-        <w:rPr>
-          <w:b/>
-        </w:rPr>
-        <w:t>Filmed since Oct 25</w:t>
-      </w:r>
-      <w:r>
-        <w:t xml:space="preserve"> that I can't see?</w:t>
-      </w:r>
-    </w:p>
-    <w:p>
-      <w:pPr>
-        <w:pStyle w:val="ListNumber"/>
-        <w:spacing w:after="40"/>
-      </w:pPr>
-      <w:r>
-        <w:rPr>
-          <w:b/>
-        </w:rPr>
-        <w:t>Street crime:</w:t>
-      </w:r>
-      <w:r>
-        <w:t xml:space="preserve"> do #4 and #7 pitch at all, given the "blue collar crime" note?</w:t>
+        <w:t>Consumer A's:</w:t>
+      </w:r>
+      <w:r>
+        <w:t xml:space="preserve"> does Jeff take #14 or #15 as an A, given his "has to be a scam" rule? Log his answer in the calibration log.</w:t>
       </w:r>
     </w:p>
     <w:p>

</xml_diff>

<commit_message>
Round 3 sheet: source links for the return-files and free-phone cards
Co-Authored-By: Claude Opus 5.5 <noreply@anthropic.com>
Claude-Session: https://claude.ai/code/session_01JtBQ6dD3dNhmh23YuYWDfa
</commit_message>
<xml_diff>
--- a/runs/W_11042026/Pre_Bible_Round3_10_28.docx
+++ b/runs/W_11042026/Pre_Bible_Round3_10_28.docx
@@ -7033,7 +7033,7 @@
         <w:t>Sources:</w:t>
       </w:r>
       <w:r>
-        <w:t xml:space="preserve"> https://www.consumerfinance.gov/consumer-tools/credit-reports-and-scores/consumer-reporting-companies/companies-list/retail-equation/ · https://www.theretailequation.com/ · BBB complaints: https://www.bbb.org/us/ca/irvine/profile/point-of-sale-systems/the-retail-equation-1126-13140940/complaints · Appriss benchmark (reported Feb 20, 2026) · NY S2440 (re-referred Jan 7, 2026)</w:t>
+        <w:t xml:space="preserve"> https://www.consumerfinance.gov/consumer-tools/credit-reports-and-scores/consumer-reporting-companies/companies-list/retail-equation/ · https://www.theretailequation.com/ · BBB complaints: https://www.bbb.org/us/ca/irvine/profile/point-of-sale-systems/the-retail-equation-1126-13140940/complaints · News4JAX, Aug 19, 2026: https://www.news4jax.com/money/2026/08/19/retailers-are-banning-shoppers-for-life-in-return-fraud-crackdown/ · NRF, Oct 15, 2025: https://nrf.com/media-center/press-releases/consumers-expected-to-return-nearly-850-billion-in-merchandise-in-2025 · Appriss benchmark, Feb 20, 2026 (vendor): https://e-commerce.news/story/retailers-face-usd-796bn-in-losses-from-returns-shrink · NY S2440: https://www.nysenate.gov/legislation/bills/2025/S2440</w:t>
       </w:r>
     </w:p>
     <w:p>
@@ -7078,7 +7078,7 @@
         <w:t>Sources:</w:t>
       </w:r>
       <w:r>
-        <w:t xml:space="preserve"> https://www.kmbc.com/article/kmbc-9-investigates-helps-kansas-man-after-att-iphone-promotion-leads-to-1200-charge/70239515 · https://www.tmonews.com/?p=59525</w:t>
+        <w:t xml:space="preserve"> https://www.kmbc.com/article/kmbc-9-investigates-helps-kansas-man-after-att-iphone-promotion-leads-to-1200-charge/70239515 · https://www.tmonews.com/?p=59525 · CBS Philadelphia, Sep 19, 2025: https://www.cbsnews.com/philadelphia/news/free-iphone-promotion-legit-xfinity-verizon-tmobile/</w:t>
       </w:r>
     </w:p>
     <w:p>

</xml_diff>